<commit_message>
feat: add Duolingo-style survey steps to onboarding
Extends the onboarding flow from 3 to 6 steps:
- How did you hear about Parla? (attribution survey)
- Why are you learning [language]? (motivation, dynamic language name)
- Where are you in your [language] studies? (starting point picker)

PRD section 11 user flow and acceptance criteria updated to match.

Co-Authored-By: Claude Fable 5 <noreply@anthropic.com>
</commit_message>
<xml_diff>
--- a/Duolingo-Clone-PRD.docx
+++ b/Duolingo-Clone-PRD.docx
@@ -7932,7 +7932,7 @@
           <w:szCs w:val="20"/>
           <w:rtl w:val="0"/>
         </w:rPr>
-        <w:t xml:space="preserve">Step 3 — Pick a daily goal: Casual 5 min, Regular 10 min, Serious 15 min, Intense 20 min. Stored in App state only — no localStorage persistence this cycle.</w:t>
+        <w:t xml:space="preserve">Step 3 — “How did you hear about Parla?”: single-select survey (friends/family, TikTok, YouTube, Instagram, Google Search, other). Marketing attribution insight, mirrors Duolingo’s onboarding survey. Stored in App state only.</w:t>
       </w:r>
     </w:p>
     <w:p>
@@ -7953,7 +7953,70 @@
           <w:szCs w:val="20"/>
           <w:rtl w:val="0"/>
         </w:rPr>
-        <w:t xml:space="preserve">Step 4 — Start lesson: a single CTA hands off to the existing quiz engine at question 1.</w:t>
+        <w:t xml:space="preserve">Step 4 — “Why are you learning [language]?”: motivation survey with the selected language name injected dynamically (connect with people, career, education, travel, fun, train my brain). Personalization signal for future curriculum work.</w:t>
+      </w:r>
+    </w:p>
+    <w:p>
+      <w:pPr>
+        <w:numPr>
+          <w:ilvl w:val="0"/>
+          <w:numId w:val="1"/>
+        </w:numPr>
+        <w:spacing w:after="40" w:before="40" w:line="240" w:lineRule="auto"/>
+        <w:ind w:left="720" w:right="0" w:hanging="360"/>
+        <w:rPr/>
+      </w:pPr>
+      <w:r>
+        <w:rPr>
+          <w:rFonts w:ascii="Arial" w:cs="Arial" w:eastAsia="Arial" w:hAnsi="Arial"/>
+          <w:color w:val="555555"/>
+          <w:sz w:val="20"/>
+          <w:szCs w:val="20"/>
+          <w:rtl w:val="0"/>
+        </w:rPr>
+        <w:t xml:space="preserve">Step 5 — “Where are you in your [language] studies?”: starting-point picker with the copy “Let’s pick a starting point — you can change this later.” Two options: new to the language (start from the beginning) or knows some (jump into the basics quiz). Both routes load the same question bank this cycle — no placement test.</w:t>
+      </w:r>
+    </w:p>
+    <w:p>
+      <w:pPr>
+        <w:numPr>
+          <w:ilvl w:val="0"/>
+          <w:numId w:val="1"/>
+        </w:numPr>
+        <w:spacing w:after="40" w:before="40" w:line="240" w:lineRule="auto"/>
+        <w:ind w:left="720" w:right="0" w:hanging="360"/>
+        <w:rPr/>
+      </w:pPr>
+      <w:r>
+        <w:rPr>
+          <w:rFonts w:ascii="Arial" w:cs="Arial" w:eastAsia="Arial" w:hAnsi="Arial"/>
+          <w:color w:val="555555"/>
+          <w:sz w:val="20"/>
+          <w:szCs w:val="20"/>
+          <w:rtl w:val="0"/>
+        </w:rPr>
+        <w:t xml:space="preserve">Step 6 — Pick a daily goal: Casual 5 min, Regular 10 min, Serious 15 min, Intense 20 min. Stored in App state only — no localStorage persistence this cycle.</w:t>
+      </w:r>
+    </w:p>
+    <w:p>
+      <w:pPr>
+        <w:numPr>
+          <w:ilvl w:val="0"/>
+          <w:numId w:val="1"/>
+        </w:numPr>
+        <w:spacing w:after="40" w:before="40" w:line="240" w:lineRule="auto"/>
+        <w:ind w:left="720" w:right="0" w:hanging="360"/>
+        <w:rPr/>
+      </w:pPr>
+      <w:r>
+        <w:rPr>
+          <w:rFonts w:ascii="Arial" w:cs="Arial" w:eastAsia="Arial" w:hAnsi="Arial"/>
+          <w:color w:val="555555"/>
+          <w:sz w:val="20"/>
+          <w:szCs w:val="20"/>
+          <w:rtl w:val="0"/>
+        </w:rPr>
+        <w:t xml:space="preserve">Step 7 — Start lesson: a single CTA hands off to the existing quiz engine at question 1.</w:t>
       </w:r>
     </w:p>
     <w:p>
@@ -8133,7 +8196,7 @@
           <w:szCs w:val="20"/>
           <w:rtl w:val="0"/>
         </w:rPr>
-        <w:t xml:space="preserve">The CTA on the language and goal steps stays disabled until an option is selected, matching the quiz CTA pattern.</w:t>
+        <w:t xml:space="preserve">The CTA on the language, survey, and goal steps stays disabled until an option is selected, matching the quiz CTA pattern.</w:t>
       </w:r>
     </w:p>
     <w:p>
@@ -8215,7 +8278,7 @@
     <w:sectPr>
       <w:headerReference r:id="rId6" w:type="default"/>
       <w:pgSz w:h="15840" w:w="12240" w:orient="portrait"/>
-      <w:pgMar w:bottom="1080" w:top="1080" w:left="1080" w:right="1080" w:header="708" w:footer="708"/>
+      <w:pgMar w:bottom="1080" w:top="1080" w:left="1080" w:right="1080" w:header="708" w:footer="708" w:gutter="0"/>
       <w:pgNumType w:start="1"/>
     </w:sectPr>
   </w:body>

</xml_diff>